<commit_message>
Add championship day scoring and analytics updates
</commit_message>
<xml_diff>
--- a/rules and logic/rules and logic.docx
+++ b/rules and logic/rules and logic.docx
@@ -87,15 +87,7 @@
     </w:p>
     <w:p>
       <w:r>
-        <w:t xml:space="preserve">- `Join Table` opens a </w:t>
-      </w:r>
-      <w:proofErr w:type="gramStart"/>
-      <w:r>
-        <w:t>room by room</w:t>
-      </w:r>
-      <w:proofErr w:type="gramEnd"/>
-      <w:r>
-        <w:t xml:space="preserve"> ID.</w:t>
+        <w:t>- `Join Table` opens a room by room ID.</w:t>
       </w:r>
     </w:p>
     <w:p>
@@ -433,15 +425,7 @@
     <w:p/>
     <w:p>
       <w:r>
-        <w:t xml:space="preserve">**Pip Ranking </w:t>
-      </w:r>
-      <w:proofErr w:type="gramStart"/>
-      <w:r>
-        <w:t>For</w:t>
-      </w:r>
-      <w:proofErr w:type="gramEnd"/>
-      <w:r>
-        <w:t xml:space="preserve"> Locked Hands**</w:t>
+        <w:t>**Pip Ranking For Locked Hands**</w:t>
       </w:r>
     </w:p>
     <w:p>
@@ -743,15 +727,7 @@
     </w:p>
     <w:p>
       <w:r>
-        <w:t xml:space="preserve">- After the last round of a 2, 5, or 10 round </w:t>
-      </w:r>
-      <w:proofErr w:type="gramStart"/>
-      <w:r>
-        <w:t>championship</w:t>
-      </w:r>
-      <w:proofErr w:type="gramEnd"/>
-      <w:r>
-        <w:t>, there is a final review.</w:t>
+        <w:t>- After the last round of a 2, 5, or 10 round championship, there is a final review.</w:t>
       </w:r>
     </w:p>
     <w:p>
@@ -1211,15 +1187,7 @@
     <w:p/>
     <w:p>
       <w:r>
-        <w:t>Primary source files reviewed: [</w:t>
-      </w:r>
-      <w:proofErr w:type="gramStart"/>
-      <w:r>
-        <w:t>dominoesEngine.js](</w:t>
-      </w:r>
-      <w:proofErr w:type="gramEnd"/>
-      <w:r>
-        <w:t>C:/wamp64/www/dominoes-app/src/dominoesEngine.js), [matchEngine.js](C:/wamp64/www/dominoes-app/</w:t>
+        <w:t>Primary source files reviewed: [dominoesEngine.js](C:/wamp64/www/dominoes-app/src/dominoesEngine.js), [matchEngine.js](C:/wamp64/www/dominoes-app/</w:t>
       </w:r>
       <w:proofErr w:type="spellStart"/>
       <w:r>

</xml_diff>